<commit_message>
Normalize AUTO case compliance
</commit_message>
<xml_diff>
--- a/18_DOCX/AUTO_CASES_0009_0012.docx
+++ b/18_DOCX/AUTO_CASES_0009_0012.docx
@@ -7,22 +7,490 @@
         <w:pStyle w:val="Heading1"/>
       </w:pPr>
       <w:r>
-        <w:t>AUTO_CASES_0009_0012 - Segundo lote de estudos de caso AUTO</w:t>
+        <w:t>AUTO_CASES_0009_0012 - Estudos de caso AUTO</w:t>
       </w:r>
     </w:p>
+    <w:p/>
+    <w:p>
+      <w:pPr>
+        <w:pStyle w:val="Heading2"/>
+      </w:pPr>
+      <w:r>
+        <w:t>Controle</w:t>
+      </w:r>
+    </w:p>
+    <w:p/>
+    <w:p>
+      <w:pPr>
+        <w:pStyle w:val="ListBullet"/>
+      </w:pPr>
+      <w:r>
+        <w:t>Versão: 0.2</w:t>
+      </w:r>
+    </w:p>
+    <w:p>
+      <w:pPr>
+        <w:pStyle w:val="ListBullet"/>
+      </w:pPr>
+      <w:r>
+        <w:t>Data: 2026-06-26</w:t>
+      </w:r>
+    </w:p>
+    <w:p>
+      <w:pPr>
+        <w:pStyle w:val="ListBullet"/>
+      </w:pPr>
+      <w:r>
+        <w:t>Autor: JP-BR Insurance Knowledge Base</w:t>
+      </w:r>
+    </w:p>
+    <w:p>
+      <w:pPr>
+        <w:pStyle w:val="ListBullet"/>
+      </w:pPr>
+      <w:r>
+        <w:t>Histórico: Consolidação atualizada com limite comercial/compliance.</w:t>
+      </w:r>
+    </w:p>
+    <w:p/>
+    <w:p>
+      <w:pPr>
+        <w:pStyle w:val="Heading2"/>
+      </w:pPr>
+      <w:r>
+        <w:t>Conteúdo consolidado</w:t>
+      </w:r>
+    </w:p>
+    <w:p/>
+    <w:p>
+      <w:pPr>
+        <w:pStyle w:val="Heading1"/>
+      </w:pPr>
+      <w:r>
+        <w:t>CASE-AUTO-0009 - Cliente acha que 自賠責保険 cobre todos os prejuízos</w:t>
+      </w:r>
+    </w:p>
+    <w:p/>
+    <w:p>
+      <w:pPr>
+        <w:pStyle w:val="Heading2"/>
+      </w:pPr>
+      <w:r>
+        <w:t>Controle</w:t>
+      </w:r>
+    </w:p>
+    <w:p/>
+    <w:p>
+      <w:pPr>
+        <w:pStyle w:val="ListBullet"/>
+      </w:pPr>
+      <w:r>
+        <w:t>Versão: 0.2</w:t>
+      </w:r>
+    </w:p>
+    <w:p>
+      <w:pPr>
+        <w:pStyle w:val="ListBullet"/>
+      </w:pPr>
+      <w:r>
+        <w:t>Data: 2026-06-25</w:t>
+      </w:r>
+    </w:p>
+    <w:p>
+      <w:pPr>
+        <w:pStyle w:val="ListBullet"/>
+      </w:pPr>
+      <w:r>
+        <w:t>Autor: JP-BR Insurance Knowledge Base</w:t>
+      </w:r>
+    </w:p>
+    <w:p>
+      <w:pPr>
+        <w:pStyle w:val="ListBullet"/>
+      </w:pPr>
+      <w:r>
+        <w:t>Histórico: Criação inicial; inclusão de limite comercial/compliance.</w:t>
+      </w:r>
+    </w:p>
+    <w:p/>
+    <w:p>
+      <w:pPr>
+        <w:pStyle w:val="Heading2"/>
+      </w:pPr>
+      <w:r>
+        <w:t>Código</w:t>
+      </w:r>
+    </w:p>
+    <w:p/>
+    <w:p>
+      <w:r>
+        <w:t>CASE-AUTO-0009</w:t>
+      </w:r>
+    </w:p>
+    <w:p/>
+    <w:p>
+      <w:pPr>
+        <w:pStyle w:val="Heading2"/>
+      </w:pPr>
+      <w:r>
+        <w:t>Produto ou categoria</w:t>
+      </w:r>
+    </w:p>
+    <w:p/>
+    <w:p>
+      <w:r>
+        <w:t>AUTO</w:t>
+      </w:r>
+    </w:p>
+    <w:p/>
+    <w:p>
+      <w:pPr>
+        <w:pStyle w:val="Heading2"/>
+      </w:pPr>
+      <w:r>
+        <w:t>Situação</w:t>
+      </w:r>
+    </w:p>
+    <w:p/>
+    <w:p>
+      <w:r>
+        <w:t>Cliente brasileiro acredita que o seguro obrigatório é suficiente para qualquer acidente.</w:t>
+      </w:r>
+    </w:p>
+    <w:p/>
+    <w:p>
+      <w:pPr>
+        <w:pStyle w:val="Heading2"/>
+      </w:pPr>
+      <w:r>
+        <w:t>Problema</w:t>
+      </w:r>
+    </w:p>
+    <w:p/>
+    <w:p>
+      <w:r>
+        <w:t>O cliente pode dirigir com falsa sensação de proteção e ficar exposto a danos materiais, próprio veículo e outros custos.</w:t>
+      </w:r>
+    </w:p>
+    <w:p/>
+    <w:p>
+      <w:pPr>
+        <w:pStyle w:val="Heading2"/>
+      </w:pPr>
+      <w:r>
+        <w:t>Análise</w:t>
+      </w:r>
+    </w:p>
+    <w:p/>
+    <w:p>
+      <w:r>
+        <w:t>自賠責保険 é obrigatório e limitado. 任意保険 amplia a proteção e pode incluir coberturas indispensáveis para riscos práticos do atendimento.</w:t>
+      </w:r>
+    </w:p>
+    <w:p/>
+    <w:p>
+      <w:pPr>
+        <w:pStyle w:val="Heading2"/>
+      </w:pPr>
+      <w:r>
+        <w:t>Orientação ao corretor</w:t>
+      </w:r>
+    </w:p>
+    <w:p/>
+    <w:p>
+      <w:r>
+        <w:t>Explicar a diferença entre exigência legal e proteção financeira real. Mostrar exemplos de prejuízos que exigem seguro voluntário.</w:t>
+      </w:r>
+    </w:p>
+    <w:p/>
+    <w:p>
+      <w:pPr>
+        <w:pStyle w:val="Heading2"/>
+      </w:pPr>
+      <w:r>
+        <w:t>Como explicar ao cliente brasileiro</w:t>
+      </w:r>
+    </w:p>
+    <w:p/>
+    <w:p>
+      <w:r>
+        <w:t>O seguro obrigatório permite cumprir a exigência legal, mas não cobre tudo. Para proteger melhor contra acidentes, danos materiais, próprio carro e outros custos, é importante avaliar o seguro voluntário.</w:t>
+      </w:r>
+    </w:p>
+    <w:p/>
+    <w:p>
+      <w:pPr>
+        <w:pStyle w:val="Heading2"/>
+      </w:pPr>
+      <w:r>
+        <w:t>Resultado esperado</w:t>
+      </w:r>
+    </w:p>
+    <w:p/>
+    <w:p>
+      <w:r>
+        <w:t>Cliente entende que 自賠責保険 não substitui 任意保険.</w:t>
+      </w:r>
+    </w:p>
+    <w:p/>
+    <w:p>
+      <w:pPr>
+        <w:pStyle w:val="Heading2"/>
+      </w:pPr>
+      <w:r>
+        <w:t>Limite comercial/compliance</w:t>
+      </w:r>
+    </w:p>
+    <w:p/>
+    <w:p>
+      <w:r>
+        <w:t>O corretor deve usar este caso como orientação de atendimento, sem prometer cobertura, valor, prazo de pagamento, aceitação de responsabilidade ou resultado de análise. A decisão final depende da apólice, documentos, circunstâncias do evento e avaliação da seguradora.</w:t>
+      </w:r>
+    </w:p>
+    <w:p/>
+    <w:p>
+      <w:pPr>
+        <w:pStyle w:val="Heading2"/>
+      </w:pPr>
+      <w:r>
+        <w:t>Termos relacionados</w:t>
+      </w:r>
+    </w:p>
+    <w:p/>
+    <w:p>
+      <w:pPr>
+        <w:pStyle w:val="ListBullet"/>
+      </w:pPr>
+      <w:r>
+        <w:t>AUTO-0011 - 自賠責保険 - Seguro obrigatório de responsabilidade civil automóvel</w:t>
+      </w:r>
+    </w:p>
+    <w:p>
+      <w:pPr>
+        <w:pStyle w:val="ListBullet"/>
+      </w:pPr>
+      <w:r>
+        <w:t>AUTO-0012 - 任意保険 - Seguro voluntário de automóvel</w:t>
+      </w:r>
+    </w:p>
+    <w:p/>
+    <w:p>
+      <w:pPr>
+        <w:pStyle w:val="Heading2"/>
+      </w:pPr>
+      <w:r>
+        <w:t>FAQs relacionadas</w:t>
+      </w:r>
+    </w:p>
+    <w:p/>
+    <w:p>
+      <w:pPr>
+        <w:pStyle w:val="ListBullet"/>
+      </w:pPr>
+      <w:r>
+        <w:t>FAQ-AUTO-0011 - Qual é a diferença entre 自賠責保険 e 任意保険?</w:t>
+      </w:r>
+    </w:p>
+    <w:p>
+      <w:pPr>
+        <w:pStyle w:val="ListBullet"/>
+      </w:pPr>
+      <w:r>
+        <w:t>FAQ-AUTO-0012 - O seguro obrigatório é suficiente?</w:t>
+      </w:r>
+    </w:p>
+    <w:p/>
+    <w:p>
+      <w:pPr>
+        <w:pStyle w:val="Heading2"/>
+      </w:pPr>
+      <w:r>
+        <w:t>Diálogos relacionados</w:t>
+      </w:r>
+    </w:p>
+    <w:p/>
+    <w:p>
+      <w:pPr>
+        <w:pStyle w:val="ListBullet"/>
+      </w:pPr>
+      <w:r>
+        <w:t>DIALOGUE-AUTO-0005 - Explicando seguro obrigatório e seguro voluntário</w:t>
+      </w:r>
+    </w:p>
+    <w:p/>
+    <w:p>
+      <w:pPr>
+        <w:pStyle w:val="Heading2"/>
+      </w:pPr>
+      <w:r>
+        <w:t>Referências cruzadas</w:t>
+      </w:r>
+    </w:p>
+    <w:p/>
+    <w:p>
+      <w:pPr>
+        <w:pStyle w:val="ListBullet"/>
+      </w:pPr>
+      <w:r>
+        <w:t>AUTO-0011</w:t>
+      </w:r>
+    </w:p>
+    <w:p>
+      <w:pPr>
+        <w:pStyle w:val="ListBullet"/>
+      </w:pPr>
+      <w:r>
+        <w:t>AUTO-0012</w:t>
+      </w:r>
+    </w:p>
+    <w:p>
+      <w:pPr>
+        <w:pStyle w:val="ListBullet"/>
+      </w:pPr>
+      <w:r>
+        <w:t>FAQ-AUTO-0011</w:t>
+      </w:r>
+    </w:p>
+    <w:p>
+      <w:pPr>
+        <w:pStyle w:val="ListBullet"/>
+      </w:pPr>
+      <w:r>
+        <w:t>DIALOGUE-AUTO-0005</w:t>
+      </w:r>
+    </w:p>
+    <w:p/>
+    <w:p>
+      <w:pPr>
+        <w:pStyle w:val="Heading2"/>
+      </w:pPr>
+      <w:r>
+        <w:t>Referências</w:t>
+      </w:r>
+    </w:p>
+    <w:p/>
+    <w:p>
+      <w:pPr>
+        <w:pStyle w:val="ListBullet"/>
+      </w:pPr>
+      <w:r>
+        <w:t>Documento interno: `02_MasterDictionary/AUTO/AUTO-0011.md`</w:t>
+      </w:r>
+    </w:p>
+    <w:p/>
+    <w:p>
+      <w:pPr>
+        <w:pStyle w:val="Heading2"/>
+      </w:pPr>
+      <w:r>
+        <w:t>Tags</w:t>
+      </w:r>
+    </w:p>
+    <w:p/>
+    <w:p>
+      <w:pPr>
+        <w:pStyle w:val="ListBullet"/>
+      </w:pPr>
+      <w:r>
+        <w:t>case</w:t>
+      </w:r>
+    </w:p>
+    <w:p>
+      <w:pPr>
+        <w:pStyle w:val="ListBullet"/>
+      </w:pPr>
+      <w:r>
+        <w:t>auto</w:t>
+      </w:r>
+    </w:p>
+    <w:p>
+      <w:pPr>
+        <w:pStyle w:val="ListBullet"/>
+      </w:pPr>
+      <w:r>
+        <w:t>seguro-obrigatorio</w:t>
+      </w:r>
+    </w:p>
+    <w:p>
+      <w:pPr>
+        <w:pStyle w:val="ListBullet"/>
+      </w:pPr>
+      <w:r>
+        <w:t>seguro-voluntario</w:t>
+      </w:r>
+    </w:p>
+    <w:p/>
+    <w:p>
+      <w:pPr>
+        <w:pStyle w:val="Heading2"/>
+      </w:pPr>
+      <w:r>
+        <w:t>Veja também</w:t>
+      </w:r>
+    </w:p>
+    <w:p/>
+    <w:p>
+      <w:pPr>
+        <w:pStyle w:val="ListBullet"/>
+      </w:pPr>
+      <w:r>
+        <w:t>`02_MasterDictionary/AUTO/AUTO-0011.md`</w:t>
+      </w:r>
+    </w:p>
+    <w:p>
+      <w:pPr>
+        <w:pStyle w:val="ListBullet"/>
+      </w:pPr>
+      <w:r>
+        <w:t>`02_MasterDictionary/AUTO/AUTO-0012.md`</w:t>
+      </w:r>
+    </w:p>
+    <w:p/>
+    <w:p>
+      <w:pPr>
+        <w:pStyle w:val="Heading2"/>
+      </w:pPr>
+      <w:r>
+        <w:t>Histórico de revisão</w:t>
+      </w:r>
+    </w:p>
+    <w:p/>
+    <w:p>
+      <w:r>
+        <w:t>| Data | Versão | Autor | Alteração |</w:t>
+      </w:r>
+    </w:p>
+    <w:p>
+      <w:r>
+        <w:t>| --- | --- | --- | --- |</w:t>
+      </w:r>
+    </w:p>
+    <w:p>
+      <w:r>
+        <w:t>| 2026-06-25 | 0.1 | JP-BR Insurance Knowledge Base | Criação inicial. |</w:t>
+      </w:r>
+    </w:p>
+    <w:p>
+      <w:r>
+        <w:t>| 2026-06-26 | 0.2 | JP-BR Insurance Knowledge Base | Inclusão de limite comercial/compliance para uso seguro em atendimento e NotebookLM. |</w:t>
+      </w:r>
+    </w:p>
+    <w:p/>
     <w:p>
       <w:r>
         <w:br w:type="page"/>
       </w:r>
     </w:p>
+    <w:p/>
     <w:p>
       <w:pPr>
         <w:pStyle w:val="Heading1"/>
       </w:pPr>
       <w:r>
-        <w:t>CASE-AUTO-0009 - Cliente acha que 自賠責保険 cobre todos os prejuízos</w:t>
+        <w:t>CASE-AUTO-0010 - Pane na estrada e uso de ロードサービス</w:t>
       </w:r>
     </w:p>
+    <w:p/>
     <w:p>
       <w:pPr>
         <w:pStyle w:val="Heading2"/>
@@ -31,12 +499,13 @@
         <w:t>Controle</w:t>
       </w:r>
     </w:p>
+    <w:p/>
     <w:p>
       <w:pPr>
         <w:pStyle w:val="ListBullet"/>
       </w:pPr>
       <w:r>
-        <w:t>Versão: 0.1</w:t>
+        <w:t>Versão: 0.2</w:t>
       </w:r>
     </w:p>
     <w:p>
@@ -60,9 +529,10 @@
         <w:pStyle w:val="ListBullet"/>
       </w:pPr>
       <w:r>
-        <w:t>Histórico: Criação inicial.</w:t>
+        <w:t>Histórico: Criação inicial; inclusão de limite comercial/compliance.</w:t>
       </w:r>
     </w:p>
+    <w:p/>
     <w:p>
       <w:pPr>
         <w:pStyle w:val="Heading2"/>
@@ -71,11 +541,13 @@
         <w:t>Código</w:t>
       </w:r>
     </w:p>
+    <w:p/>
     <w:p>
       <w:r>
-        <w:t>CASE-AUTO-0009</w:t>
+        <w:t>CASE-AUTO-0010</w:t>
       </w:r>
     </w:p>
+    <w:p/>
     <w:p>
       <w:pPr>
         <w:pStyle w:val="Heading2"/>
@@ -84,11 +556,13 @@
         <w:t>Produto ou categoria</w:t>
       </w:r>
     </w:p>
+    <w:p/>
     <w:p>
       <w:r>
         <w:t>AUTO</w:t>
       </w:r>
     </w:p>
+    <w:p/>
     <w:p>
       <w:pPr>
         <w:pStyle w:val="Heading2"/>
@@ -97,11 +571,13 @@
         <w:t>Situação</w:t>
       </w:r>
     </w:p>
+    <w:p/>
     <w:p>
       <w:r>
-        <w:t>Cliente brasileiro acredita que o seguro obrigatório é suficiente para qualquer acidente.</w:t>
+        <w:t>Cliente fica parado na estrada por pane e quer saber se o seguro envia guincho e carro substituto.</w:t>
       </w:r>
     </w:p>
+    <w:p/>
     <w:p>
       <w:pPr>
         <w:pStyle w:val="Heading2"/>
@@ -110,11 +586,13 @@
         <w:t>Problema</w:t>
       </w:r>
     </w:p>
+    <w:p/>
     <w:p>
       <w:r>
-        <w:t>O cliente pode dirigir com falsa sensação de proteção e ficar exposto a danos materiais, próprio veículo e outros custos.</w:t>
+        <w:t>Cliente mistura ロードサービス com 代車費用特約 e espera que ambos estejam sempre incluídos.</w:t>
       </w:r>
     </w:p>
+    <w:p/>
     <w:p>
       <w:pPr>
         <w:pStyle w:val="Heading2"/>
@@ -123,11 +601,13 @@
         <w:t>Análise</w:t>
       </w:r>
     </w:p>
+    <w:p/>
     <w:p>
       <w:r>
-        <w:t>自賠責保険 é obrigatório e limitado. 任意保険 amplia a proteção e pode incluir coberturas indispensáveis para riscos práticos do atendimento.</w:t>
+        <w:t>ロードサービス pode cobrir atendimento emergencial, como guincho ou bateria. 代車費用特約 é outra cobertura, voltada a carro substituto, e deve ser verificada separadamente.</w:t>
       </w:r>
     </w:p>
+    <w:p/>
     <w:p>
       <w:pPr>
         <w:pStyle w:val="Heading2"/>
@@ -136,11 +616,13 @@
         <w:t>Orientação ao corretor</w:t>
       </w:r>
     </w:p>
+    <w:p/>
     <w:p>
       <w:r>
-        <w:t>Explicar a diferença entre exigência legal e proteção financeira real. Mostrar exemplos de prejuízos que exigem seguro voluntário.</w:t>
+        <w:t>Confirmar localização, segurança, tipo de problema e serviços incluídos no contrato. Depois separar assistência emergencial de carro substituto.</w:t>
       </w:r>
     </w:p>
+    <w:p/>
     <w:p>
       <w:pPr>
         <w:pStyle w:val="Heading2"/>
@@ -149,11 +631,13 @@
         <w:t>Como explicar ao cliente brasileiro</w:t>
       </w:r>
     </w:p>
+    <w:p/>
     <w:p>
       <w:r>
-        <w:t>O seguro obrigatório permite cumprir a exigência legal, mas não cobre tudo. Para proteger melhor contra acidentes, danos materiais, próprio carro e outros custos, é importante avaliar o seguro voluntário.</w:t>
+        <w:t>Primeiro vamos verificar a assistência na estrada para resolver a emergência. O carro substituto é outra cobertura e depende de estar contratado e das condições do contrato.</w:t>
       </w:r>
     </w:p>
+    <w:p/>
     <w:p>
       <w:pPr>
         <w:pStyle w:val="Heading2"/>
@@ -162,11 +646,28 @@
         <w:t>Resultado esperado</w:t>
       </w:r>
     </w:p>
+    <w:p/>
     <w:p>
       <w:r>
-        <w:t>Cliente entende que 自賠責保険 não substitui 任意保険.</w:t>
+        <w:t>Cliente entende qual serviço resolve a emergência e quais limites se aplicam.</w:t>
       </w:r>
     </w:p>
+    <w:p/>
+    <w:p>
+      <w:pPr>
+        <w:pStyle w:val="Heading2"/>
+      </w:pPr>
+      <w:r>
+        <w:t>Limite comercial/compliance</w:t>
+      </w:r>
+    </w:p>
+    <w:p/>
+    <w:p>
+      <w:r>
+        <w:t>O corretor deve usar este caso como orientação de atendimento, sem prometer cobertura, valor, prazo de pagamento, aceitação de responsabilidade ou resultado de análise. A decisão final depende da apólice, documentos, circunstâncias do evento e avaliação da seguradora.</w:t>
+      </w:r>
+    </w:p>
+    <w:p/>
     <w:p>
       <w:pPr>
         <w:pStyle w:val="Heading2"/>
@@ -175,12 +676,13 @@
         <w:t>Termos relacionados</w:t>
       </w:r>
     </w:p>
+    <w:p/>
     <w:p>
       <w:pPr>
         <w:pStyle w:val="ListBullet"/>
       </w:pPr>
       <w:r>
-        <w:t>AUTO-0011 - 自賠責保険 - Seguro obrigatório de responsabilidade civil automóvel</w:t>
+        <w:t>AUTO-0013 - ロードサービス - Assistência na estrada</w:t>
       </w:r>
     </w:p>
     <w:p>
@@ -188,9 +690,10 @@
         <w:pStyle w:val="ListBullet"/>
       </w:pPr>
       <w:r>
-        <w:t>AUTO-0012 - 任意保険 - Seguro voluntário de automóvel</w:t>
+        <w:t>AUTO-0015 - 代車費用特約 - Cobertura adicional de carro substituto</w:t>
       </w:r>
     </w:p>
+    <w:p/>
     <w:p>
       <w:pPr>
         <w:pStyle w:val="Heading2"/>
@@ -199,12 +702,13 @@
         <w:t>FAQs relacionadas</w:t>
       </w:r>
     </w:p>
+    <w:p/>
     <w:p>
       <w:pPr>
         <w:pStyle w:val="ListBullet"/>
       </w:pPr>
       <w:r>
-        <w:t>FAQ-AUTO-0011 - Qual é a diferença entre 自賠責保険 e 任意保険?</w:t>
+        <w:t>FAQ-AUTO-0013 - Quando posso usar o serviço de assistência na estrada?</w:t>
       </w:r>
     </w:p>
     <w:p>
@@ -212,9 +716,10 @@
         <w:pStyle w:val="ListBullet"/>
       </w:pPr>
       <w:r>
-        <w:t>FAQ-AUTO-0012 - O seguro obrigatório é suficiente?</w:t>
+        <w:t>FAQ-AUTO-0015 - Quando tenho direito a carro substituto?</w:t>
       </w:r>
     </w:p>
+    <w:p/>
     <w:p>
       <w:pPr>
         <w:pStyle w:val="Heading2"/>
@@ -223,14 +728,16 @@
         <w:t>Diálogos relacionados</w:t>
       </w:r>
     </w:p>
+    <w:p/>
     <w:p>
       <w:pPr>
         <w:pStyle w:val="ListBullet"/>
       </w:pPr>
       <w:r>
-        <w:t>DIALOGUE-AUTO-0005 - Explicando seguro obrigatório e seguro voluntário</w:t>
+        <w:t>DIALOGUE-AUTO-0006 - Explicando assistência na estrada e carro substituto</w:t>
       </w:r>
     </w:p>
+    <w:p/>
     <w:p>
       <w:pPr>
         <w:pStyle w:val="Heading2"/>
@@ -239,12 +746,13 @@
         <w:t>Referências cruzadas</w:t>
       </w:r>
     </w:p>
+    <w:p/>
     <w:p>
       <w:pPr>
         <w:pStyle w:val="ListBullet"/>
       </w:pPr>
       <w:r>
-        <w:t>AUTO-0011</w:t>
+        <w:t>AUTO-0013</w:t>
       </w:r>
     </w:p>
     <w:p>
@@ -252,7 +760,7 @@
         <w:pStyle w:val="ListBullet"/>
       </w:pPr>
       <w:r>
-        <w:t>AUTO-0012</w:t>
+        <w:t>AUTO-0015</w:t>
       </w:r>
     </w:p>
     <w:p>
@@ -260,7 +768,7 @@
         <w:pStyle w:val="ListBullet"/>
       </w:pPr>
       <w:r>
-        <w:t>FAQ-AUTO-0011</w:t>
+        <w:t>FAQ-AUTO-0013</w:t>
       </w:r>
     </w:p>
     <w:p>
@@ -268,9 +776,10 @@
         <w:pStyle w:val="ListBullet"/>
       </w:pPr>
       <w:r>
-        <w:t>DIALOGUE-AUTO-0005</w:t>
+        <w:t>DIALOGUE-AUTO-0006</w:t>
       </w:r>
     </w:p>
+    <w:p/>
     <w:p>
       <w:pPr>
         <w:pStyle w:val="Heading2"/>
@@ -279,14 +788,16 @@
         <w:t>Referências</w:t>
       </w:r>
     </w:p>
+    <w:p/>
     <w:p>
       <w:pPr>
         <w:pStyle w:val="ListBullet"/>
       </w:pPr>
       <w:r>
-        <w:t>Documento interno: `02_MasterDictionary/AUTO/AUTO-0011.md`</w:t>
+        <w:t>Documento interno: `02_MasterDictionary/AUTO/AUTO-0013.md`</w:t>
       </w:r>
     </w:p>
+    <w:p/>
     <w:p>
       <w:pPr>
         <w:pStyle w:val="Heading2"/>
@@ -295,6 +806,7 @@
         <w:t>Tags</w:t>
       </w:r>
     </w:p>
+    <w:p/>
     <w:p>
       <w:pPr>
         <w:pStyle w:val="ListBullet"/>
@@ -316,7 +828,7 @@
         <w:pStyle w:val="ListBullet"/>
       </w:pPr>
       <w:r>
-        <w:t>seguro-obrigatorio</w:t>
+        <w:t>pane</w:t>
       </w:r>
     </w:p>
     <w:p>
@@ -324,9 +836,18 @@
         <w:pStyle w:val="ListBullet"/>
       </w:pPr>
       <w:r>
-        <w:t>seguro-voluntario</w:t>
+        <w:t>assistencia</w:t>
       </w:r>
     </w:p>
+    <w:p>
+      <w:pPr>
+        <w:pStyle w:val="ListBullet"/>
+      </w:pPr>
+      <w:r>
+        <w:t>carro-substituto</w:t>
+      </w:r>
+    </w:p>
+    <w:p/>
     <w:p>
       <w:pPr>
         <w:pStyle w:val="Heading2"/>
@@ -335,12 +856,13 @@
         <w:t>Veja também</w:t>
       </w:r>
     </w:p>
+    <w:p/>
     <w:p>
       <w:pPr>
         <w:pStyle w:val="ListBullet"/>
       </w:pPr>
       <w:r>
-        <w:t>`02_MasterDictionary/AUTO/AUTO-0011.md`</w:t>
+        <w:t>`02_MasterDictionary/AUTO/AUTO-0013.md`</w:t>
       </w:r>
     </w:p>
     <w:p>
@@ -348,9 +870,10 @@
         <w:pStyle w:val="ListBullet"/>
       </w:pPr>
       <w:r>
-        <w:t>`02_MasterDictionary/AUTO/AUTO-0012.md`</w:t>
+        <w:t>`02_MasterDictionary/AUTO/AUTO-0015.md`</w:t>
       </w:r>
     </w:p>
+    <w:p/>
     <w:p>
       <w:pPr>
         <w:pStyle w:val="Heading2"/>
@@ -359,46 +882,43 @@
         <w:t>Histórico de revisão</w:t>
       </w:r>
     </w:p>
+    <w:p/>
     <w:p>
       <w:r>
-        <w:rPr>
-          <w:rFonts w:ascii="Courier New" w:hAnsi="Courier New"/>
-          <w:sz w:val="16"/>
-        </w:rPr>
         <w:t>| Data | Versão | Autor | Alteração |</w:t>
       </w:r>
     </w:p>
     <w:p>
       <w:r>
-        <w:rPr>
-          <w:rFonts w:ascii="Courier New" w:hAnsi="Courier New"/>
-          <w:sz w:val="16"/>
-        </w:rPr>
         <w:t>| --- | --- | --- | --- |</w:t>
       </w:r>
     </w:p>
     <w:p>
       <w:r>
-        <w:rPr>
-          <w:rFonts w:ascii="Courier New" w:hAnsi="Courier New"/>
-          <w:sz w:val="16"/>
-        </w:rPr>
         <w:t>| 2026-06-25 | 0.1 | JP-BR Insurance Knowledge Base | Criação inicial. |</w:t>
       </w:r>
     </w:p>
     <w:p>
       <w:r>
+        <w:t>| 2026-06-26 | 0.2 | JP-BR Insurance Knowledge Base | Inclusão de limite comercial/compliance para uso seguro em atendimento e NotebookLM. |</w:t>
+      </w:r>
+    </w:p>
+    <w:p/>
+    <w:p>
+      <w:r>
         <w:br w:type="page"/>
       </w:r>
     </w:p>
+    <w:p/>
     <w:p>
       <w:pPr>
         <w:pStyle w:val="Heading1"/>
       </w:pPr>
       <w:r>
-        <w:t>CASE-AUTO-0010 - Pane na estrada e uso de ロードサービス</w:t>
+        <w:t>CASE-AUTO-0011 - Acidente com motorista fora da restrição de condutores</w:t>
       </w:r>
     </w:p>
+    <w:p/>
     <w:p>
       <w:pPr>
         <w:pStyle w:val="Heading2"/>
@@ -407,12 +927,13 @@
         <w:t>Controle</w:t>
       </w:r>
     </w:p>
+    <w:p/>
     <w:p>
       <w:pPr>
         <w:pStyle w:val="ListBullet"/>
       </w:pPr>
       <w:r>
-        <w:t>Versão: 0.1</w:t>
+        <w:t>Versão: 0.2</w:t>
       </w:r>
     </w:p>
     <w:p>
@@ -436,9 +957,10 @@
         <w:pStyle w:val="ListBullet"/>
       </w:pPr>
       <w:r>
-        <w:t>Histórico: Criação inicial.</w:t>
+        <w:t>Histórico: Criação inicial; inclusão de limite comercial/compliance.</w:t>
       </w:r>
     </w:p>
+    <w:p/>
     <w:p>
       <w:pPr>
         <w:pStyle w:val="Heading2"/>
@@ -447,11 +969,13 @@
         <w:t>Código</w:t>
       </w:r>
     </w:p>
+    <w:p/>
     <w:p>
       <w:r>
-        <w:t>CASE-AUTO-0010</w:t>
+        <w:t>CASE-AUTO-0011</w:t>
       </w:r>
     </w:p>
+    <w:p/>
     <w:p>
       <w:pPr>
         <w:pStyle w:val="Heading2"/>
@@ -460,11 +984,13 @@
         <w:t>Produto ou categoria</w:t>
       </w:r>
     </w:p>
+    <w:p/>
     <w:p>
       <w:r>
         <w:t>AUTO</w:t>
       </w:r>
     </w:p>
+    <w:p/>
     <w:p>
       <w:pPr>
         <w:pStyle w:val="Heading2"/>
@@ -473,11 +999,13 @@
         <w:t>Situação</w:t>
       </w:r>
     </w:p>
+    <w:p/>
     <w:p>
       <w:r>
-        <w:t>Cliente fica parado na estrada por pane e quer saber se o seguro envia guincho e carro substituto.</w:t>
+        <w:t>Filho do segurado dirige o carro e sofre acidente, mas o contrato tinha restrição de condutores ou idade.</w:t>
       </w:r>
     </w:p>
+    <w:p/>
     <w:p>
       <w:pPr>
         <w:pStyle w:val="Heading2"/>
@@ -486,11 +1014,13 @@
         <w:t>Problema</w:t>
       </w:r>
     </w:p>
+    <w:p/>
     <w:p>
       <w:r>
-        <w:t>Cliente mistura ロードサービス com 代車費用特約 e espera que ambos estejam sempre incluídos.</w:t>
+        <w:t>Cliente não percebeu que reduzir o escopo de condutores poderia afetar a cobertura.</w:t>
       </w:r>
     </w:p>
+    <w:p/>
     <w:p>
       <w:pPr>
         <w:pStyle w:val="Heading2"/>
@@ -499,11 +1029,13 @@
         <w:t>Análise</w:t>
       </w:r>
     </w:p>
+    <w:p/>
     <w:p>
       <w:r>
-        <w:t>ロードサービス pode cobrir atendimento emergencial, como guincho ou bateria. 代車費用特約 é outra cobertura, voltada a carro substituto, e deve ser verificada separadamente.</w:t>
+        <w:t>運転者限定 e 年齢条件 definem quem está coberto. Se o motorista estiver fora dessas condições, pode haver recusa ou limitação de cobertura.</w:t>
       </w:r>
     </w:p>
+    <w:p/>
     <w:p>
       <w:pPr>
         <w:pStyle w:val="Heading2"/>
@@ -512,11 +1044,13 @@
         <w:t>Orientação ao corretor</w:t>
       </w:r>
     </w:p>
+    <w:p/>
     <w:p>
       <w:r>
-        <w:t>Confirmar localização, segurança, tipo de problema e serviços incluídos no contrato. Depois separar assistência emergencial de carro substituto.</w:t>
+        <w:t>No atendimento de contratação, perguntar quem realmente dirige o veículo. Em sinistro, verificar contrato antes de prometer cobertura.</w:t>
       </w:r>
     </w:p>
+    <w:p/>
     <w:p>
       <w:pPr>
         <w:pStyle w:val="Heading2"/>
@@ -525,11 +1059,13 @@
         <w:t>Como explicar ao cliente brasileiro</w:t>
       </w:r>
     </w:p>
+    <w:p/>
     <w:p>
       <w:r>
-        <w:t>Primeiro vamos verificar a assistência na estrada para resolver a emergência. O carro substituto é outra cobertura e depende de estar contratado e das condições do contrato.</w:t>
+        <w:t>O contrato define quem pode dirigir com cobertura. Se uma pessoa fora dessa regra dirige, o seguro pode não funcionar como esperado. Por isso, essas condições precisam refletir o uso real do carro.</w:t>
       </w:r>
     </w:p>
+    <w:p/>
     <w:p>
       <w:pPr>
         <w:pStyle w:val="Heading2"/>
@@ -538,11 +1074,28 @@
         <w:t>Resultado esperado</w:t>
       </w:r>
     </w:p>
+    <w:p/>
     <w:p>
       <w:r>
-        <w:t>Cliente entende qual serviço resolve a emergência e quais limites se aplicam.</w:t>
+        <w:t>Cliente entende por que restrição de condutores e idade são pontos críticos.</w:t>
       </w:r>
     </w:p>
+    <w:p/>
+    <w:p>
+      <w:pPr>
+        <w:pStyle w:val="Heading2"/>
+      </w:pPr>
+      <w:r>
+        <w:t>Limite comercial/compliance</w:t>
+      </w:r>
+    </w:p>
+    <w:p/>
+    <w:p>
+      <w:r>
+        <w:t>O corretor deve usar este caso como orientação de atendimento, sem prometer cobertura, valor, prazo de pagamento, aceitação de responsabilidade ou resultado de análise. A decisão final depende da apólice, documentos, circunstâncias do evento e avaliação da seguradora.</w:t>
+      </w:r>
+    </w:p>
+    <w:p/>
     <w:p>
       <w:pPr>
         <w:pStyle w:val="Heading2"/>
@@ -551,12 +1104,13 @@
         <w:t>Termos relacionados</w:t>
       </w:r>
     </w:p>
+    <w:p/>
     <w:p>
       <w:pPr>
         <w:pStyle w:val="ListBullet"/>
       </w:pPr>
       <w:r>
-        <w:t>AUTO-0013 - ロードサービス - Assistência na estrada</w:t>
+        <w:t>AUTO-0016 - 運転者限定 - Restrição de condutores</w:t>
       </w:r>
     </w:p>
     <w:p>
@@ -564,9 +1118,18 @@
         <w:pStyle w:val="ListBullet"/>
       </w:pPr>
       <w:r>
-        <w:t>AUTO-0015 - 代車費用特約 - Cobertura adicional de carro substituto</w:t>
+        <w:t>AUTO-0017 - 年齢条件 - Condição de idade do condutor</w:t>
       </w:r>
     </w:p>
+    <w:p>
+      <w:pPr>
+        <w:pStyle w:val="ListBullet"/>
+      </w:pPr>
+      <w:r>
+        <w:t>AUTO-0018 - 使用目的 - Finalidade de uso do veículo</w:t>
+      </w:r>
+    </w:p>
+    <w:p/>
     <w:p>
       <w:pPr>
         <w:pStyle w:val="Heading2"/>
@@ -575,12 +1138,13 @@
         <w:t>FAQs relacionadas</w:t>
       </w:r>
     </w:p>
+    <w:p/>
     <w:p>
       <w:pPr>
         <w:pStyle w:val="ListBullet"/>
       </w:pPr>
       <w:r>
-        <w:t>FAQ-AUTO-0013 - Quando posso usar o serviço de assistência na estrada?</w:t>
+        <w:t>FAQ-AUTO-0016 - Quem pode dirigir o carro segurado?</w:t>
       </w:r>
     </w:p>
     <w:p>
@@ -588,9 +1152,18 @@
         <w:pStyle w:val="ListBullet"/>
       </w:pPr>
       <w:r>
-        <w:t>FAQ-AUTO-0015 - Quando tenho direito a carro substituto?</w:t>
+        <w:t>FAQ-AUTO-0017 - A idade do motorista muda o preço do seguro?</w:t>
       </w:r>
     </w:p>
+    <w:p>
+      <w:pPr>
+        <w:pStyle w:val="ListBullet"/>
+      </w:pPr>
+      <w:r>
+        <w:t>FAQ-AUTO-0018 - Por que preciso informar a finalidade de uso do carro?</w:t>
+      </w:r>
+    </w:p>
+    <w:p/>
     <w:p>
       <w:pPr>
         <w:pStyle w:val="Heading2"/>
@@ -599,14 +1172,16 @@
         <w:t>Diálogos relacionados</w:t>
       </w:r>
     </w:p>
+    <w:p/>
     <w:p>
       <w:pPr>
         <w:pStyle w:val="ListBullet"/>
       </w:pPr>
       <w:r>
-        <w:t>DIALOGUE-AUTO-0006 - Explicando assistência na estrada e carro substituto</w:t>
+        <w:t>DIALOGUE-AUTO-0007 - Explicando restrição de condutores e condição de idade</w:t>
       </w:r>
     </w:p>
+    <w:p/>
     <w:p>
       <w:pPr>
         <w:pStyle w:val="Heading2"/>
@@ -615,12 +1190,13 @@
         <w:t>Referências cruzadas</w:t>
       </w:r>
     </w:p>
+    <w:p/>
     <w:p>
       <w:pPr>
         <w:pStyle w:val="ListBullet"/>
       </w:pPr>
       <w:r>
-        <w:t>AUTO-0013</w:t>
+        <w:t>AUTO-0016</w:t>
       </w:r>
     </w:p>
     <w:p>
@@ -628,7 +1204,7 @@
         <w:pStyle w:val="ListBullet"/>
       </w:pPr>
       <w:r>
-        <w:t>AUTO-0015</w:t>
+        <w:t>AUTO-0017</w:t>
       </w:r>
     </w:p>
     <w:p>
@@ -636,7 +1212,7 @@
         <w:pStyle w:val="ListBullet"/>
       </w:pPr>
       <w:r>
-        <w:t>FAQ-AUTO-0013</w:t>
+        <w:t>FAQ-AUTO-0016</w:t>
       </w:r>
     </w:p>
     <w:p>
@@ -644,9 +1220,10 @@
         <w:pStyle w:val="ListBullet"/>
       </w:pPr>
       <w:r>
-        <w:t>DIALOGUE-AUTO-0006</w:t>
+        <w:t>DIALOGUE-AUTO-0007</w:t>
       </w:r>
     </w:p>
+    <w:p/>
     <w:p>
       <w:pPr>
         <w:pStyle w:val="Heading2"/>
@@ -655,14 +1232,16 @@
         <w:t>Referências</w:t>
       </w:r>
     </w:p>
+    <w:p/>
     <w:p>
       <w:pPr>
         <w:pStyle w:val="ListBullet"/>
       </w:pPr>
       <w:r>
-        <w:t>Documento interno: `02_MasterDictionary/AUTO/AUTO-0013.md`</w:t>
+        <w:t>Documento interno: `02_MasterDictionary/AUTO/AUTO-0016.md`</w:t>
       </w:r>
     </w:p>
+    <w:p/>
     <w:p>
       <w:pPr>
         <w:pStyle w:val="Heading2"/>
@@ -671,6 +1250,7 @@
         <w:t>Tags</w:t>
       </w:r>
     </w:p>
+    <w:p/>
     <w:p>
       <w:pPr>
         <w:pStyle w:val="ListBullet"/>
@@ -692,7 +1272,7 @@
         <w:pStyle w:val="ListBullet"/>
       </w:pPr>
       <w:r>
-        <w:t>pane</w:t>
+        <w:t>condutor</w:t>
       </w:r>
     </w:p>
     <w:p>
@@ -700,7 +1280,7 @@
         <w:pStyle w:val="ListBullet"/>
       </w:pPr>
       <w:r>
-        <w:t>assistencia</w:t>
+        <w:t>idade</w:t>
       </w:r>
     </w:p>
     <w:p>
@@ -708,9 +1288,10 @@
         <w:pStyle w:val="ListBullet"/>
       </w:pPr>
       <w:r>
-        <w:t>carro-substituto</w:t>
+        <w:t>cobertura</w:t>
       </w:r>
     </w:p>
+    <w:p/>
     <w:p>
       <w:pPr>
         <w:pStyle w:val="Heading2"/>
@@ -719,12 +1300,13 @@
         <w:t>Veja também</w:t>
       </w:r>
     </w:p>
+    <w:p/>
     <w:p>
       <w:pPr>
         <w:pStyle w:val="ListBullet"/>
       </w:pPr>
       <w:r>
-        <w:t>`02_MasterDictionary/AUTO/AUTO-0013.md`</w:t>
+        <w:t>`02_MasterDictionary/AUTO/AUTO-0016.md`</w:t>
       </w:r>
     </w:p>
     <w:p>
@@ -732,9 +1314,10 @@
         <w:pStyle w:val="ListBullet"/>
       </w:pPr>
       <w:r>
-        <w:t>`02_MasterDictionary/AUTO/AUTO-0015.md`</w:t>
+        <w:t>`02_MasterDictionary/AUTO/AUTO-0017.md`</w:t>
       </w:r>
     </w:p>
+    <w:p/>
     <w:p>
       <w:pPr>
         <w:pStyle w:val="Heading2"/>
@@ -743,46 +1326,43 @@
         <w:t>Histórico de revisão</w:t>
       </w:r>
     </w:p>
+    <w:p/>
     <w:p>
       <w:r>
-        <w:rPr>
-          <w:rFonts w:ascii="Courier New" w:hAnsi="Courier New"/>
-          <w:sz w:val="16"/>
-        </w:rPr>
         <w:t>| Data | Versão | Autor | Alteração |</w:t>
       </w:r>
     </w:p>
     <w:p>
       <w:r>
-        <w:rPr>
-          <w:rFonts w:ascii="Courier New" w:hAnsi="Courier New"/>
-          <w:sz w:val="16"/>
-        </w:rPr>
         <w:t>| --- | --- | --- | --- |</w:t>
       </w:r>
     </w:p>
     <w:p>
       <w:r>
-        <w:rPr>
-          <w:rFonts w:ascii="Courier New" w:hAnsi="Courier New"/>
-          <w:sz w:val="16"/>
-        </w:rPr>
         <w:t>| 2026-06-25 | 0.1 | JP-BR Insurance Knowledge Base | Criação inicial. |</w:t>
       </w:r>
     </w:p>
     <w:p>
       <w:r>
+        <w:t>| 2026-06-26 | 0.2 | JP-BR Insurance Knowledge Base | Inclusão de limite comercial/compliance para uso seguro em atendimento e NotebookLM. |</w:t>
+      </w:r>
+    </w:p>
+    <w:p/>
+    <w:p>
+      <w:r>
         <w:br w:type="page"/>
       </w:r>
     </w:p>
+    <w:p/>
     <w:p>
       <w:pPr>
         <w:pStyle w:val="Heading1"/>
       </w:pPr>
       <w:r>
-        <w:t>CASE-AUTO-0011 - Acidente com motorista fora da restrição de condutores</w:t>
+        <w:t>CASE-AUTO-0012 - Cliente precisa de 交通事故証明書 após colisão</w:t>
       </w:r>
     </w:p>
+    <w:p/>
     <w:p>
       <w:pPr>
         <w:pStyle w:val="Heading2"/>
@@ -791,12 +1371,13 @@
         <w:t>Controle</w:t>
       </w:r>
     </w:p>
+    <w:p/>
     <w:p>
       <w:pPr>
         <w:pStyle w:val="ListBullet"/>
       </w:pPr>
       <w:r>
-        <w:t>Versão: 0.1</w:t>
+        <w:t>Versão: 0.2</w:t>
       </w:r>
     </w:p>
     <w:p>
@@ -820,9 +1401,10 @@
         <w:pStyle w:val="ListBullet"/>
       </w:pPr>
       <w:r>
-        <w:t>Histórico: Criação inicial.</w:t>
+        <w:t>Histórico: Criação inicial; inclusão de limite comercial/compliance.</w:t>
       </w:r>
     </w:p>
+    <w:p/>
     <w:p>
       <w:pPr>
         <w:pStyle w:val="Heading2"/>
@@ -831,11 +1413,13 @@
         <w:t>Código</w:t>
       </w:r>
     </w:p>
+    <w:p/>
     <w:p>
       <w:r>
-        <w:t>CASE-AUTO-0011</w:t>
+        <w:t>CASE-AUTO-0012</w:t>
       </w:r>
     </w:p>
+    <w:p/>
     <w:p>
       <w:pPr>
         <w:pStyle w:val="Heading2"/>
@@ -844,11 +1428,13 @@
         <w:t>Produto ou categoria</w:t>
       </w:r>
     </w:p>
+    <w:p/>
     <w:p>
       <w:r>
         <w:t>AUTO</w:t>
       </w:r>
     </w:p>
+    <w:p/>
     <w:p>
       <w:pPr>
         <w:pStyle w:val="Heading2"/>
@@ -857,11 +1443,13 @@
         <w:t>Situação</w:t>
       </w:r>
     </w:p>
+    <w:p/>
     <w:p>
       <w:r>
-        <w:t>Filho do segurado dirige o carro e sofre acidente, mas o contrato tinha restrição de condutores ou idade.</w:t>
+        <w:t>Cliente sofre colisão e a seguradora solicita documento oficial relacionado ao acidente.</w:t>
       </w:r>
     </w:p>
+    <w:p/>
     <w:p>
       <w:pPr>
         <w:pStyle w:val="Heading2"/>
@@ -870,11 +1458,13 @@
         <w:t>Problema</w:t>
       </w:r>
     </w:p>
+    <w:p/>
     <w:p>
       <w:r>
-        <w:t>Cliente não percebeu que reduzir o escopo de condutores poderia afetar a cobertura.</w:t>
+        <w:t>Cliente não sabe por que precisa de 交通事故証明書 nem entende a importância de registrar o acidente corretamente.</w:t>
       </w:r>
     </w:p>
+    <w:p/>
     <w:p>
       <w:pPr>
         <w:pStyle w:val="Heading2"/>
@@ -883,11 +1473,13 @@
         <w:t>Análise</w:t>
       </w:r>
     </w:p>
+    <w:p/>
     <w:p>
       <w:r>
-        <w:t>運転者限定 e 年齢条件 definem quem está coberto. Se o motorista estiver fora dessas condições, pode haver recusa ou limitação de cobertura.</w:t>
+        <w:t>交通事故証明書 pode ser necessário para comprovar a ocorrência do acidente. O 事故受付 inicia o atendimento, mas documentos oficiais podem ser exigidos na análise.</w:t>
       </w:r>
     </w:p>
+    <w:p/>
     <w:p>
       <w:pPr>
         <w:pStyle w:val="Heading2"/>
@@ -896,11 +1488,13 @@
         <w:t>Orientação ao corretor</w:t>
       </w:r>
     </w:p>
+    <w:p/>
     <w:p>
       <w:r>
-        <w:t>No atendimento de contratação, perguntar quem realmente dirige o veículo. Em sinistro, verificar contrato antes de prometer cobertura.</w:t>
+        <w:t>Explicar a diferença entre avisar a seguradora e comprovar oficialmente o acidente. Orientar o cliente a seguir os procedimentos formais.</w:t>
       </w:r>
     </w:p>
+    <w:p/>
     <w:p>
       <w:pPr>
         <w:pStyle w:val="Heading2"/>
@@ -909,11 +1503,13 @@
         <w:t>Como explicar ao cliente brasileiro</w:t>
       </w:r>
     </w:p>
+    <w:p/>
     <w:p>
       <w:r>
-        <w:t>O contrato define quem pode dirigir com cobertura. Se uma pessoa fora dessa regra dirige, o seguro pode não funcionar como esperado. Por isso, essas condições precisam refletir o uso real do carro.</w:t>
+        <w:t>O aviso para a seguradora inicia o atendimento, mas o certificado de acidente é um documento oficial que pode ser pedido para comprovar o acidente. Por isso, o registro correto é importante.</w:t>
       </w:r>
     </w:p>
+    <w:p/>
     <w:p>
       <w:pPr>
         <w:pStyle w:val="Heading2"/>
@@ -922,11 +1518,28 @@
         <w:t>Resultado esperado</w:t>
       </w:r>
     </w:p>
+    <w:p/>
     <w:p>
       <w:r>
-        <w:t>Cliente entende por que restrição de condutores e idade são pontos críticos.</w:t>
+        <w:t>Cliente entende a função do certificado e reúne a documentação necessária.</w:t>
       </w:r>
     </w:p>
+    <w:p/>
+    <w:p>
+      <w:pPr>
+        <w:pStyle w:val="Heading2"/>
+      </w:pPr>
+      <w:r>
+        <w:t>Limite comercial/compliance</w:t>
+      </w:r>
+    </w:p>
+    <w:p/>
+    <w:p>
+      <w:r>
+        <w:t>O corretor deve usar este caso como orientação de atendimento, sem prometer cobertura, valor, prazo de pagamento, aceitação de responsabilidade ou resultado de análise. A decisão final depende da apólice, documentos, circunstâncias do evento e avaliação da seguradora.</w:t>
+      </w:r>
+    </w:p>
+    <w:p/>
     <w:p>
       <w:pPr>
         <w:pStyle w:val="Heading2"/>
@@ -935,12 +1548,13 @@
         <w:t>Termos relacionados</w:t>
       </w:r>
     </w:p>
+    <w:p/>
     <w:p>
       <w:pPr>
         <w:pStyle w:val="ListBullet"/>
       </w:pPr>
       <w:r>
-        <w:t>AUTO-0016 - 運転者限定 - Restrição de condutores</w:t>
+        <w:t>AUTO-0019 - 事故受付 - Registro de aviso de acidente</w:t>
       </w:r>
     </w:p>
     <w:p>
@@ -948,7 +1562,7 @@
         <w:pStyle w:val="ListBullet"/>
       </w:pPr>
       <w:r>
-        <w:t>AUTO-0017 - 年齢条件 - Condição de idade do condutor</w:t>
+        <w:t>AUTO-0020 - 交通事故証明書 - Certificado de acidente de trânsito</w:t>
       </w:r>
     </w:p>
     <w:p>
@@ -956,9 +1570,10 @@
         <w:pStyle w:val="ListBullet"/>
       </w:pPr>
       <w:r>
-        <w:t>AUTO-0018 - 使用目的 - Finalidade de uso do veículo</w:t>
+        <w:t>AUTO-0014 - 弁護士費用特約 - Cobertura adicional de honorários advocatícios</w:t>
       </w:r>
     </w:p>
+    <w:p/>
     <w:p>
       <w:pPr>
         <w:pStyle w:val="Heading2"/>
@@ -967,12 +1582,13 @@
         <w:t>FAQs relacionadas</w:t>
       </w:r>
     </w:p>
+    <w:p/>
     <w:p>
       <w:pPr>
         <w:pStyle w:val="ListBullet"/>
       </w:pPr>
       <w:r>
-        <w:t>FAQ-AUTO-0016 - Quem pode dirigir o carro segurado?</w:t>
+        <w:t>FAQ-AUTO-0019 - O que devo fazer logo após um acidente?</w:t>
       </w:r>
     </w:p>
     <w:p>
@@ -980,7 +1596,7 @@
         <w:pStyle w:val="ListBullet"/>
       </w:pPr>
       <w:r>
-        <w:t>FAQ-AUTO-0017 - A idade do motorista muda o preço do seguro?</w:t>
+        <w:t>FAQ-AUTO-0020 - Para que serve o certificado de acidente de trânsito?</w:t>
       </w:r>
     </w:p>
     <w:p>
@@ -988,9 +1604,10 @@
         <w:pStyle w:val="ListBullet"/>
       </w:pPr>
       <w:r>
-        <w:t>FAQ-AUTO-0018 - Por que preciso informar a finalidade de uso do carro?</w:t>
+        <w:t>FAQ-AUTO-0014 - Para que serve a cobertura de advogado?</w:t>
       </w:r>
     </w:p>
+    <w:p/>
     <w:p>
       <w:pPr>
         <w:pStyle w:val="Heading2"/>
@@ -999,14 +1616,16 @@
         <w:t>Diálogos relacionados</w:t>
       </w:r>
     </w:p>
+    <w:p/>
     <w:p>
       <w:pPr>
         <w:pStyle w:val="ListBullet"/>
       </w:pPr>
       <w:r>
-        <w:t>DIALOGUE-AUTO-0007 - Explicando restrição de condutores e condição de idade</w:t>
+        <w:t>DIALOGUE-AUTO-0008 - Orientando cliente após acidente</w:t>
       </w:r>
     </w:p>
+    <w:p/>
     <w:p>
       <w:pPr>
         <w:pStyle w:val="Heading2"/>
@@ -1015,12 +1634,13 @@
         <w:t>Referências cruzadas</w:t>
       </w:r>
     </w:p>
+    <w:p/>
     <w:p>
       <w:pPr>
         <w:pStyle w:val="ListBullet"/>
       </w:pPr>
       <w:r>
-        <w:t>AUTO-0016</w:t>
+        <w:t>AUTO-0019</w:t>
       </w:r>
     </w:p>
     <w:p>
@@ -1028,7 +1648,7 @@
         <w:pStyle w:val="ListBullet"/>
       </w:pPr>
       <w:r>
-        <w:t>AUTO-0017</w:t>
+        <w:t>AUTO-0020</w:t>
       </w:r>
     </w:p>
     <w:p>
@@ -1036,7 +1656,7 @@
         <w:pStyle w:val="ListBullet"/>
       </w:pPr>
       <w:r>
-        <w:t>FAQ-AUTO-0016</w:t>
+        <w:t>FAQ-AUTO-0020</w:t>
       </w:r>
     </w:p>
     <w:p>
@@ -1044,9 +1664,10 @@
         <w:pStyle w:val="ListBullet"/>
       </w:pPr>
       <w:r>
-        <w:t>DIALOGUE-AUTO-0007</w:t>
+        <w:t>DIALOGUE-AUTO-0008</w:t>
       </w:r>
     </w:p>
+    <w:p/>
     <w:p>
       <w:pPr>
         <w:pStyle w:val="Heading2"/>
@@ -1055,14 +1676,16 @@
         <w:t>Referências</w:t>
       </w:r>
     </w:p>
+    <w:p/>
     <w:p>
       <w:pPr>
         <w:pStyle w:val="ListBullet"/>
       </w:pPr>
       <w:r>
-        <w:t>Documento interno: `02_MasterDictionary/AUTO/AUTO-0016.md`</w:t>
+        <w:t>Documento interno: `02_MasterDictionary/AUTO/AUTO-0020.md`</w:t>
       </w:r>
     </w:p>
+    <w:p/>
     <w:p>
       <w:pPr>
         <w:pStyle w:val="Heading2"/>
@@ -1071,6 +1694,7 @@
         <w:t>Tags</w:t>
       </w:r>
     </w:p>
+    <w:p/>
     <w:p>
       <w:pPr>
         <w:pStyle w:val="ListBullet"/>
@@ -1092,7 +1716,7 @@
         <w:pStyle w:val="ListBullet"/>
       </w:pPr>
       <w:r>
-        <w:t>condutor</w:t>
+        <w:t>acidente</w:t>
       </w:r>
     </w:p>
     <w:p>
@@ -1100,7 +1724,7 @@
         <w:pStyle w:val="ListBullet"/>
       </w:pPr>
       <w:r>
-        <w:t>idade</w:t>
+        <w:t>certificado</w:t>
       </w:r>
     </w:p>
     <w:p>
@@ -1108,9 +1732,10 @@
         <w:pStyle w:val="ListBullet"/>
       </w:pPr>
       <w:r>
-        <w:t>cobertura</w:t>
+        <w:t>documento</w:t>
       </w:r>
     </w:p>
+    <w:p/>
     <w:p>
       <w:pPr>
         <w:pStyle w:val="Heading2"/>
@@ -1119,12 +1744,13 @@
         <w:t>Veja também</w:t>
       </w:r>
     </w:p>
+    <w:p/>
     <w:p>
       <w:pPr>
         <w:pStyle w:val="ListBullet"/>
       </w:pPr>
       <w:r>
-        <w:t>`02_MasterDictionary/AUTO/AUTO-0016.md`</w:t>
+        <w:t>`02_MasterDictionary/AUTO/AUTO-0019.md`</w:t>
       </w:r>
     </w:p>
     <w:p>
@@ -1132,9 +1758,10 @@
         <w:pStyle w:val="ListBullet"/>
       </w:pPr>
       <w:r>
-        <w:t>`02_MasterDictionary/AUTO/AUTO-0017.md`</w:t>
+        <w:t>`02_MasterDictionary/AUTO/AUTO-0020.md`</w:t>
       </w:r>
     </w:p>
+    <w:p/>
     <w:p>
       <w:pPr>
         <w:pStyle w:val="Heading2"/>
@@ -1143,398 +1770,28 @@
         <w:t>Histórico de revisão</w:t>
       </w:r>
     </w:p>
+    <w:p/>
     <w:p>
       <w:r>
-        <w:rPr>
-          <w:rFonts w:ascii="Courier New" w:hAnsi="Courier New"/>
-          <w:sz w:val="16"/>
-        </w:rPr>
         <w:t>| Data | Versão | Autor | Alteração |</w:t>
       </w:r>
     </w:p>
     <w:p>
       <w:r>
-        <w:rPr>
-          <w:rFonts w:ascii="Courier New" w:hAnsi="Courier New"/>
-          <w:sz w:val="16"/>
-        </w:rPr>
         <w:t>| --- | --- | --- | --- |</w:t>
       </w:r>
     </w:p>
     <w:p>
       <w:r>
-        <w:rPr>
-          <w:rFonts w:ascii="Courier New" w:hAnsi="Courier New"/>
-          <w:sz w:val="16"/>
-        </w:rPr>
         <w:t>| 2026-06-25 | 0.1 | JP-BR Insurance Knowledge Base | Criação inicial. |</w:t>
       </w:r>
     </w:p>
     <w:p>
       <w:r>
-        <w:br w:type="page"/>
+        <w:t>| 2026-06-26 | 0.2 | JP-BR Insurance Knowledge Base | Inclusão de limite comercial/compliance para uso seguro em atendimento e NotebookLM. |</w:t>
       </w:r>
     </w:p>
-    <w:p>
-      <w:pPr>
-        <w:pStyle w:val="Heading1"/>
-      </w:pPr>
-      <w:r>
-        <w:t>CASE-AUTO-0012 - Cliente precisa de 交通事故証明書 após colisão</w:t>
-      </w:r>
-    </w:p>
-    <w:p>
-      <w:pPr>
-        <w:pStyle w:val="Heading2"/>
-      </w:pPr>
-      <w:r>
-        <w:t>Controle</w:t>
-      </w:r>
-    </w:p>
-    <w:p>
-      <w:pPr>
-        <w:pStyle w:val="ListBullet"/>
-      </w:pPr>
-      <w:r>
-        <w:t>Versão: 0.1</w:t>
-      </w:r>
-    </w:p>
-    <w:p>
-      <w:pPr>
-        <w:pStyle w:val="ListBullet"/>
-      </w:pPr>
-      <w:r>
-        <w:t>Data: 2026-06-25</w:t>
-      </w:r>
-    </w:p>
-    <w:p>
-      <w:pPr>
-        <w:pStyle w:val="ListBullet"/>
-      </w:pPr>
-      <w:r>
-        <w:t>Autor: JP-BR Insurance Knowledge Base</w:t>
-      </w:r>
-    </w:p>
-    <w:p>
-      <w:pPr>
-        <w:pStyle w:val="ListBullet"/>
-      </w:pPr>
-      <w:r>
-        <w:t>Histórico: Criação inicial.</w:t>
-      </w:r>
-    </w:p>
-    <w:p>
-      <w:pPr>
-        <w:pStyle w:val="Heading2"/>
-      </w:pPr>
-      <w:r>
-        <w:t>Código</w:t>
-      </w:r>
-    </w:p>
-    <w:p>
-      <w:r>
-        <w:t>CASE-AUTO-0012</w:t>
-      </w:r>
-    </w:p>
-    <w:p>
-      <w:pPr>
-        <w:pStyle w:val="Heading2"/>
-      </w:pPr>
-      <w:r>
-        <w:t>Produto ou categoria</w:t>
-      </w:r>
-    </w:p>
-    <w:p>
-      <w:r>
-        <w:t>AUTO</w:t>
-      </w:r>
-    </w:p>
-    <w:p>
-      <w:pPr>
-        <w:pStyle w:val="Heading2"/>
-      </w:pPr>
-      <w:r>
-        <w:t>Situação</w:t>
-      </w:r>
-    </w:p>
-    <w:p>
-      <w:r>
-        <w:t>Cliente sofre colisão e a seguradora solicita documento oficial relacionado ao acidente.</w:t>
-      </w:r>
-    </w:p>
-    <w:p>
-      <w:pPr>
-        <w:pStyle w:val="Heading2"/>
-      </w:pPr>
-      <w:r>
-        <w:t>Problema</w:t>
-      </w:r>
-    </w:p>
-    <w:p>
-      <w:r>
-        <w:t>Cliente não sabe por que precisa de 交通事故証明書 nem entende a importância de registrar o acidente corretamente.</w:t>
-      </w:r>
-    </w:p>
-    <w:p>
-      <w:pPr>
-        <w:pStyle w:val="Heading2"/>
-      </w:pPr>
-      <w:r>
-        <w:t>Análise</w:t>
-      </w:r>
-    </w:p>
-    <w:p>
-      <w:r>
-        <w:t>交通事故証明書 pode ser necessário para comprovar a ocorrência do acidente. O 事故受付 inicia o atendimento, mas documentos oficiais podem ser exigidos na análise.</w:t>
-      </w:r>
-    </w:p>
-    <w:p>
-      <w:pPr>
-        <w:pStyle w:val="Heading2"/>
-      </w:pPr>
-      <w:r>
-        <w:t>Orientação ao corretor</w:t>
-      </w:r>
-    </w:p>
-    <w:p>
-      <w:r>
-        <w:t>Explicar a diferença entre avisar a seguradora e comprovar oficialmente o acidente. Orientar o cliente a seguir os procedimentos formais.</w:t>
-      </w:r>
-    </w:p>
-    <w:p>
-      <w:pPr>
-        <w:pStyle w:val="Heading2"/>
-      </w:pPr>
-      <w:r>
-        <w:t>Como explicar ao cliente brasileiro</w:t>
-      </w:r>
-    </w:p>
-    <w:p>
-      <w:r>
-        <w:t>O aviso para a seguradora inicia o atendimento, mas o certificado de acidente é um documento oficial que pode ser pedido para comprovar o acidente. Por isso, o registro correto é importante.</w:t>
-      </w:r>
-    </w:p>
-    <w:p>
-      <w:pPr>
-        <w:pStyle w:val="Heading2"/>
-      </w:pPr>
-      <w:r>
-        <w:t>Resultado esperado</w:t>
-      </w:r>
-    </w:p>
-    <w:p>
-      <w:r>
-        <w:t>Cliente entende a função do certificado e reúne a documentação necessária.</w:t>
-      </w:r>
-    </w:p>
-    <w:p>
-      <w:pPr>
-        <w:pStyle w:val="Heading2"/>
-      </w:pPr>
-      <w:r>
-        <w:t>Termos relacionados</w:t>
-      </w:r>
-    </w:p>
-    <w:p>
-      <w:pPr>
-        <w:pStyle w:val="ListBullet"/>
-      </w:pPr>
-      <w:r>
-        <w:t>AUTO-0019 - 事故受付 - Registro de aviso de acidente</w:t>
-      </w:r>
-    </w:p>
-    <w:p>
-      <w:pPr>
-        <w:pStyle w:val="ListBullet"/>
-      </w:pPr>
-      <w:r>
-        <w:t>AUTO-0020 - 交通事故証明書 - Certificado de acidente de trânsito</w:t>
-      </w:r>
-    </w:p>
-    <w:p>
-      <w:pPr>
-        <w:pStyle w:val="ListBullet"/>
-      </w:pPr>
-      <w:r>
-        <w:t>AUTO-0014 - 弁護士費用特約 - Cobertura adicional de honorários advocatícios</w:t>
-      </w:r>
-    </w:p>
-    <w:p>
-      <w:pPr>
-        <w:pStyle w:val="Heading2"/>
-      </w:pPr>
-      <w:r>
-        <w:t>FAQs relacionadas</w:t>
-      </w:r>
-    </w:p>
-    <w:p>
-      <w:pPr>
-        <w:pStyle w:val="ListBullet"/>
-      </w:pPr>
-      <w:r>
-        <w:t>FAQ-AUTO-0019 - O que devo fazer logo após um acidente?</w:t>
-      </w:r>
-    </w:p>
-    <w:p>
-      <w:pPr>
-        <w:pStyle w:val="ListBullet"/>
-      </w:pPr>
-      <w:r>
-        <w:t>FAQ-AUTO-0020 - Para que serve o certificado de acidente de trânsito?</w:t>
-      </w:r>
-    </w:p>
-    <w:p>
-      <w:pPr>
-        <w:pStyle w:val="ListBullet"/>
-      </w:pPr>
-      <w:r>
-        <w:t>FAQ-AUTO-0014 - Para que serve a cobertura de advogado?</w:t>
-      </w:r>
-    </w:p>
-    <w:p>
-      <w:pPr>
-        <w:pStyle w:val="Heading2"/>
-      </w:pPr>
-      <w:r>
-        <w:t>Diálogos relacionados</w:t>
-      </w:r>
-    </w:p>
-    <w:p>
-      <w:pPr>
-        <w:pStyle w:val="ListBullet"/>
-      </w:pPr>
-      <w:r>
-        <w:t>DIALOGUE-AUTO-0008 - Orientando cliente após acidente</w:t>
-      </w:r>
-    </w:p>
-    <w:p>
-      <w:pPr>
-        <w:pStyle w:val="Heading2"/>
-      </w:pPr>
-      <w:r>
-        <w:t>Referências cruzadas</w:t>
-      </w:r>
-    </w:p>
-    <w:p>
-      <w:pPr>
-        <w:pStyle w:val="ListBullet"/>
-      </w:pPr>
-      <w:r>
-        <w:t>AUTO-0019</w:t>
-      </w:r>
-    </w:p>
-    <w:p>
-      <w:pPr>
-        <w:pStyle w:val="ListBullet"/>
-      </w:pPr>
-      <w:r>
-        <w:t>AUTO-0020</w:t>
-      </w:r>
-    </w:p>
-    <w:p>
-      <w:pPr>
-        <w:pStyle w:val="ListBullet"/>
-      </w:pPr>
-      <w:r>
-        <w:t>FAQ-AUTO-0020</w:t>
-      </w:r>
-    </w:p>
-    <w:p>
-      <w:pPr>
-        <w:pStyle w:val="ListBullet"/>
-      </w:pPr>
-      <w:r>
-        <w:t>DIALOGUE-AUTO-0008</w:t>
-      </w:r>
-    </w:p>
-    <w:p>
-      <w:pPr>
-        <w:pStyle w:val="Heading2"/>
-      </w:pPr>
-      <w:r>
-        <w:t>Referências</w:t>
-      </w:r>
-    </w:p>
-    <w:p>
-      <w:pPr>
-        <w:pStyle w:val="ListBullet"/>
-      </w:pPr>
-      <w:r>
-        <w:t>Documento interno: `02_MasterDictionary/AUTO/AUTO-0020.md`</w:t>
-      </w:r>
-    </w:p>
-    <w:p>
-      <w:pPr>
-        <w:pStyle w:val="Heading2"/>
-      </w:pPr>
-      <w:r>
-        <w:t>Tags</w:t>
-      </w:r>
-    </w:p>
-    <w:p>
-      <w:pPr>
-        <w:pStyle w:val="ListBullet"/>
-      </w:pPr>
-      <w:r>
-        <w:t>case</w:t>
-      </w:r>
-    </w:p>
-    <w:p>
-      <w:pPr>
-        <w:pStyle w:val="ListBullet"/>
-      </w:pPr>
-      <w:r>
-        <w:t>auto</w:t>
-      </w:r>
-    </w:p>
-    <w:p>
-      <w:pPr>
-        <w:pStyle w:val="ListBullet"/>
-      </w:pPr>
-      <w:r>
-        <w:t>acidente</w:t>
-      </w:r>
-    </w:p>
-    <w:p>
-      <w:pPr>
-        <w:pStyle w:val="ListBullet"/>
-      </w:pPr>
-      <w:r>
-        <w:t>certificado</w:t>
-      </w:r>
-    </w:p>
-    <w:p>
-      <w:pPr>
-        <w:pStyle w:val="ListBullet"/>
-      </w:pPr>
-      <w:r>
-        <w:t>documento</w:t>
-      </w:r>
-    </w:p>
-    <w:p>
-      <w:pPr>
-        <w:pStyle w:val="Heading2"/>
-      </w:pPr>
-      <w:r>
-        <w:t>Veja também</w:t>
-      </w:r>
-    </w:p>
-    <w:p>
-      <w:pPr>
-        <w:pStyle w:val="ListBullet"/>
-      </w:pPr>
-      <w:r>
-        <w:t>`02_MasterDictionary/AUTO/AUTO-0019.md`</w:t>
-      </w:r>
-    </w:p>
-    <w:p>
-      <w:pPr>
-        <w:pStyle w:val="ListBullet"/>
-      </w:pPr>
-      <w:r>
-        <w:t>`02_MasterDictionary/AUTO/AUTO-0020.md`</w:t>
-      </w:r>
-    </w:p>
+    <w:p/>
     <w:p>
       <w:pPr>
         <w:pStyle w:val="Heading2"/>
@@ -1543,36 +1800,25 @@
         <w:t>Histórico de revisão</w:t>
       </w:r>
     </w:p>
+    <w:p/>
     <w:p>
       <w:r>
-        <w:rPr>
-          <w:rFonts w:ascii="Courier New" w:hAnsi="Courier New"/>
-          <w:sz w:val="16"/>
-        </w:rPr>
         <w:t>| Data | Versão | Autor | Alteração |</w:t>
       </w:r>
     </w:p>
     <w:p>
       <w:r>
-        <w:rPr>
-          <w:rFonts w:ascii="Courier New" w:hAnsi="Courier New"/>
-          <w:sz w:val="16"/>
-        </w:rPr>
         <w:t>| --- | --- | --- | --- |</w:t>
       </w:r>
     </w:p>
     <w:p>
       <w:r>
-        <w:rPr>
-          <w:rFonts w:ascii="Courier New" w:hAnsi="Courier New"/>
-          <w:sz w:val="16"/>
-        </w:rPr>
-        <w:t>| 2026-06-25 | 0.1 | JP-BR Insurance Knowledge Base | Criação inicial. |</w:t>
+        <w:t>| 2026-06-26 | 0.2 | JP-BR Insurance Knowledge Base | Regeneração do pacote com normalização de compliance dos estudos de caso AUTO. |</w:t>
       </w:r>
     </w:p>
     <w:sectPr>
       <w:pgSz w:w="12240" w:h="15840"/>
-      <w:pgMar w:top="1080" w:right="1224" w:bottom="1080" w:left="1224" w:header="720" w:footer="720" w:gutter="0"/>
+      <w:pgMar w:top="1440" w:right="1800" w:bottom="1440" w:left="1800" w:header="720" w:footer="720" w:gutter="0"/>
       <w:cols w:space="720"/>
       <w:docGrid w:linePitch="360"/>
     </w:sectPr>

</xml_diff>